<commit_message>
docs: update PRD for current Azure architecture
</commit_message>
<xml_diff>
--- a/docs/BuildPay AI PRD.docx
+++ b/docs/BuildPay AI PRD.docx
@@ -2,6 +2,14 @@
 <file path=word/document.xml><?xml version="1.0" encoding="utf-8"?>
 <w:document xmlns:wpc="http://schemas.microsoft.com/office/word/2010/wordprocessingCanvas" xmlns:cx="http://schemas.microsoft.com/office/drawing/2014/chartex" xmlns:cx1="http://schemas.microsoft.com/office/drawing/2015/9/8/chartex" xmlns:cx2="http://schemas.microsoft.com/office/drawing/2015/10/21/chartex" xmlns:cx3="http://schemas.microsoft.com/office/drawing/2016/5/9/chartex" xmlns:cx4="http://schemas.microsoft.com/office/drawing/2016/5/10/chartex" xmlns:cx5="http://schemas.microsoft.com/office/drawing/2016/5/11/chartex" xmlns:cx6="http://schemas.microsoft.com/office/drawing/2016/5/12/chartex" xmlns:cx7="http://schemas.microsoft.com/office/drawing/2016/5/13/chartex" xmlns:cx8="http://schemas.microsoft.com/office/drawing/2016/5/14/chartex" xmlns:mc="http://schemas.openxmlformats.org/markup-compatibility/2006" xmlns:aink="http://schemas.microsoft.com/office/drawing/2016/ink" xmlns:am3d="http://schemas.microsoft.com/office/drawing/2017/model3d" xmlns:o="urn:schemas-microsoft-com:office:office" xmlns:oel="http://schemas.microsoft.com/office/2019/extlst" xmlns:r="http://schemas.openxmlformats.org/officeDocument/2006/relationships" xmlns:m="http://schemas.openxmlformats.org/officeDocument/2006/math" xmlns:v="urn:schemas-microsoft-com:vml" xmlns:wp14="http://schemas.microsoft.com/office/word/2010/wordprocessingDrawing" xmlns:wp="http://schemas.openxmlformats.org/drawingml/2006/wordprocessingDrawing" xmlns:w10="urn:schemas-microsoft-com:office:word" xmlns:w="http://schemas.openxmlformats.org/wordprocessingml/2006/main" xmlns:w14="http://schemas.microsoft.com/office/word/2010/wordml" xmlns:w15="http://schemas.microsoft.com/office/word/2012/wordml" xmlns:w16cex="http://schemas.microsoft.com/office/word/2018/wordml/cex" xmlns:w16cid="http://schemas.microsoft.com/office/word/2016/wordml/cid" xmlns:w16="http://schemas.microsoft.com/office/word/2018/wordml" xmlns:w16du="http://schemas.microsoft.com/office/word/2023/wordml/word16du" xmlns:w16sdtdh="http://schemas.microsoft.com/office/word/2020/wordml/sdtdatahash" xmlns:w16sdtfl="http://schemas.microsoft.com/office/word/2024/wordml/sdtformatlock" xmlns:w16se="http://schemas.microsoft.com/office/word/2015/wordml/symex" xmlns:wpg="http://schemas.microsoft.com/office/word/2010/wordprocessingGroup" xmlns:wpi="http://schemas.microsoft.com/office/word/2010/wordprocessingInk" xmlns:wne="http://schemas.microsoft.com/office/word/2006/wordml" xmlns:wps="http://schemas.microsoft.com/office/word/2010/wordprocessingShape" mc:Ignorable="w14 w15 w16se w16cid w16 w16cex w16sdtdh w16sdtfl w16du wp14">
   <w:body>
+    <w:p>
+      <w:r>
+        <w:rPr>
+          <w:b/>
+        </w:rPr>
+        <w:t>CURRENT IMPLEMENTATION NOTICE — October 2026: The original Streamlit deployment description in this PRD is superseded. BuildPay AI is now implemented as a Next.js/React web application with a FastAPI backend and PostgreSQL, deployed to Microsoft Azure.</w:t>
+      </w:r>
+    </w:p>
     <w:p>
       <w:pPr>
         <w:jc w:val="center"/>
@@ -7123,6 +7131,249 @@
           <w:b/>
         </w:rPr>
         <w:t>END OF PRODUCT REQUIREMENTS DOCUMENT</w:t>
+      </w:r>
+    </w:p>
+    <w:p>
+      <w:r>
+        <w:br w:type="page"/>
+      </w:r>
+    </w:p>
+    <w:p>
+      <w:pPr>
+        <w:pStyle w:val="Heading1"/>
+      </w:pPr>
+      <w:r>
+        <w:t>Current Implementation &amp; Deployment Update</w:t>
+      </w:r>
+    </w:p>
+    <w:p>
+      <w:r>
+        <w:rPr>
+          <w:b/>
+        </w:rPr>
+        <w:t xml:space="preserve">Status: </w:t>
+      </w:r>
+      <w:r>
+        <w:t>This section supersedes earlier Streamlit-specific deployment details and reflects the current BuildPay AI implementation and Azure deployment.</w:t>
+      </w:r>
+    </w:p>
+    <w:p>
+      <w:pPr>
+        <w:pStyle w:val="Heading2"/>
+      </w:pPr>
+      <w:r>
+        <w:t>1. Current Application UI</w:t>
+      </w:r>
+    </w:p>
+    <w:p>
+      <w:r>
+        <w:t>BuildPay AI uses a modern Next.js 16 + React 19 frontend with TypeScript, Tailwind CSS, Radix UI components, Lucide icons, Framer Motion animations, and Recharts for data visualisation. The public experience starts at a dedicated landing page, followed by login and authenticated project-control workflows. The production UI is not a Streamlit application.</w:t>
+      </w:r>
+    </w:p>
+    <w:p>
+      <w:pPr>
+        <w:pStyle w:val="Heading2"/>
+      </w:pPr>
+      <w:r>
+        <w:t>2. Backend &amp; Data Layer</w:t>
+      </w:r>
+    </w:p>
+    <w:p>
+      <w:r>
+        <w:t>The backend is implemented with Python FastAPI and PostgreSQL database access. Authentication uses JWT-based access tokens. The application exposes REST APIs for projects, BOQ items, check requests, measurements, variations, IPC/payment workflows, documents, reports, AI findings, and audit events.</w:t>
+      </w:r>
+    </w:p>
+    <w:p>
+      <w:pPr>
+        <w:pStyle w:val="Heading2"/>
+      </w:pPr>
+      <w:r>
+        <w:t>3. AI / Agent Framework Status</w:t>
+      </w:r>
+    </w:p>
+    <w:p>
+      <w:r>
+        <w:t>CrewAI is NOT used in the current BuildPay AI implementation. There is no CrewAI dependency or CrewAI-based orchestration in the repository. AI functionality follows the product principle: AI prepares, checks, calculates and flags; humans authorize. The current implementation uses the application's backend services and configured LLM integration rather than a CrewAI multi-agent runtime.</w:t>
+      </w:r>
+    </w:p>
+    <w:p>
+      <w:pPr>
+        <w:pStyle w:val="Heading2"/>
+      </w:pPr>
+      <w:r>
+        <w:t>4. Azure Deployment Architecture</w:t>
+      </w:r>
+    </w:p>
+    <w:p>
+      <w:pPr>
+        <w:pStyle w:val="ListBullet"/>
+      </w:pPr>
+      <w:r>
+        <w:t>Microsoft Azure Container Apps hosts the frontend and backend as separate containerised services.</w:t>
+      </w:r>
+    </w:p>
+    <w:p>
+      <w:pPr>
+        <w:pStyle w:val="ListBullet"/>
+      </w:pPr>
+      <w:r>
+        <w:t>Azure Container Registry (ACR) stores the BuildPay AI frontend and backend Docker images.</w:t>
+      </w:r>
+    </w:p>
+    <w:p>
+      <w:pPr>
+        <w:pStyle w:val="ListBullet"/>
+      </w:pPr>
+      <w:r>
+        <w:t>Azure Database for PostgreSQL Flexible Server provides the production relational database.</w:t>
+      </w:r>
+    </w:p>
+    <w:p>
+      <w:pPr>
+        <w:pStyle w:val="ListBullet"/>
+      </w:pPr>
+      <w:r>
+        <w:t>Azure Container Apps Environment provides the shared managed container runtime and networking.</w:t>
+      </w:r>
+    </w:p>
+    <w:p>
+      <w:pPr>
+        <w:pStyle w:val="ListBullet"/>
+      </w:pPr>
+      <w:r>
+        <w:t>Azure Log Analytics is associated with the Container Apps environment for application/container logs.</w:t>
+      </w:r>
+    </w:p>
+    <w:p>
+      <w:pPr>
+        <w:pStyle w:val="ListBullet"/>
+      </w:pPr>
+      <w:r>
+        <w:t>The deployment uses HTTPS public ingress for the frontend and backend Container Apps.</w:t>
+      </w:r>
+    </w:p>
+    <w:p>
+      <w:pPr>
+        <w:pStyle w:val="Heading2"/>
+      </w:pPr>
+      <w:r>
+        <w:t>5. Current Azure Resources</w:t>
+      </w:r>
+    </w:p>
+    <w:p>
+      <w:pPr>
+        <w:pStyle w:val="ListBullet"/>
+      </w:pPr>
+      <w:r>
+        <w:t>Resource group: buildpay-ai-rg</w:t>
+      </w:r>
+    </w:p>
+    <w:p>
+      <w:pPr>
+        <w:pStyle w:val="ListBullet"/>
+      </w:pPr>
+      <w:r>
+        <w:t>Container Apps environment: buildpay-ai-env</w:t>
+      </w:r>
+    </w:p>
+    <w:p>
+      <w:pPr>
+        <w:pStyle w:val="ListBullet"/>
+      </w:pPr>
+      <w:r>
+        <w:t>Container Registry: buildpayaiacr5908</w:t>
+      </w:r>
+    </w:p>
+    <w:p>
+      <w:pPr>
+        <w:pStyle w:val="ListBullet"/>
+      </w:pPr>
+      <w:r>
+        <w:t>Backend Container App: buildpay-backend</w:t>
+      </w:r>
+    </w:p>
+    <w:p>
+      <w:pPr>
+        <w:pStyle w:val="ListBullet"/>
+      </w:pPr>
+      <w:r>
+        <w:t>Frontend Container App: buildpay-frontend</w:t>
+      </w:r>
+    </w:p>
+    <w:p>
+      <w:pPr>
+        <w:pStyle w:val="ListBullet"/>
+      </w:pPr>
+      <w:r>
+        <w:t>PostgreSQL Flexible Server: buildpay-pg-3136</w:t>
+      </w:r>
+    </w:p>
+    <w:p>
+      <w:pPr>
+        <w:pStyle w:val="ListBullet"/>
+      </w:pPr>
+      <w:r>
+        <w:t>Database: buildpay</w:t>
+      </w:r>
+    </w:p>
+    <w:p>
+      <w:pPr>
+        <w:pStyle w:val="ListBullet"/>
+      </w:pPr>
+      <w:r>
+        <w:t>Azure region: Central India</w:t>
+      </w:r>
+    </w:p>
+    <w:p>
+      <w:pPr>
+        <w:pStyle w:val="Heading2"/>
+      </w:pPr>
+      <w:r>
+        <w:t>6. Deployment Model</w:t>
+      </w:r>
+    </w:p>
+    <w:p>
+      <w:r>
+        <w:t>Both application tiers are built as Docker images. Images are pushed to Azure Container Registry and deployed to Azure Container Apps. The frontend is built with the production API base URL baked into the Next.js public environment configuration at build time. The backend receives database, JWT, LLM, and CORS configuration through Azure Container Apps environment variables and secret references rather than storing production secrets in the repository.</w:t>
+      </w:r>
+    </w:p>
+    <w:p>
+      <w:pPr>
+        <w:pStyle w:val="Heading2"/>
+      </w:pPr>
+      <w:r>
+        <w:t>7. Demo &amp; Role-Based Access</w:t>
+      </w:r>
+    </w:p>
+    <w:p>
+      <w:r>
+        <w:t>The application supports seeded demonstration accounts for Admin, Contractor, Consultant/QS, Client and Project Manager workflows. Role-based authorization remains enforced by the backend; the frontend login/demo-account UI is only a user experience layer.</w:t>
+      </w:r>
+    </w:p>
+    <w:p>
+      <w:pPr>
+        <w:pStyle w:val="Heading2"/>
+      </w:pPr>
+      <w:r>
+        <w:t>8. Product Principle</w:t>
+      </w:r>
+    </w:p>
+    <w:p>
+      <w:r>
+        <w:t>BuildPay AI remains a human-in-the-loop construction project controls platform. AI assists with preparation, checking, calculations and anomaly/issue flagging, while authorized project participants retain responsibility for approvals, certifications and payments.</w:t>
+      </w:r>
+    </w:p>
+    <w:p>
+      <w:pPr>
+        <w:pStyle w:val="Heading2"/>
+      </w:pPr>
+      <w:r>
+        <w:t>9. Superseded Streamlit Deployment</w:t>
+      </w:r>
+    </w:p>
+    <w:p>
+      <w:r>
+        <w:t>Any earlier section of this PRD that describes deploying BuildPay AI as a Streamlit app, including Streamlit-specific hosting, UI, startup commands or deployment instructions, should be treated as legacy project history and not as the current implementation. The authoritative deployment model is the Next.js + FastAPI + PostgreSQL stack described above, containerised with Docker and deployed on Azure Container Apps.</w:t>
       </w:r>
     </w:p>
     <w:sectPr>

</xml_diff>